<commit_message>
Align module 4 backend docs with exam brief
</commit_message>
<xml_diff>
--- a/moodul4/dokumentatsioon/dokumentatsioon.docx
+++ b/moodul4/dokumentatsioon/dokumentatsioon.docx
@@ -4,165 +4,43 @@
   <w:body>
     <w:p>
       <w:pPr>
-        <w:pStyle w:val="Title"/>
+        <w:pStyle w:val="Heading1"/>
       </w:pPr>
       <w:r>
-        <w:t>Moodul 4 – dokumentatsioon (custom backend)</w:t>
+        <w:t>Module 4 documentation</w:t>
       </w:r>
     </w:p>
     <w:p>
       <w:r>
-        <w:t>Projekt: NEXUS tiimileht + e-pood + kontakt.</w:t>
+        <w:t>Student: Taaniel Vananurm</w:t>
+      </w:r>
+    </w:p>
+    <w:p>
+      <w:r>
+        <w:t>Group: MM-23</w:t>
+      </w:r>
+    </w:p>
+    <w:p>
+      <w:r>
+        <w:t>Project: NEXUS esports site</w:t>
       </w:r>
     </w:p>
     <w:p>
       <w:pPr>
-        <w:pStyle w:val="Heading1"/>
+        <w:pStyle w:val="Heading2"/>
       </w:pPr>
       <w:r>
-        <w:t>1. Keele valik (põhjendus)</w:t>
+        <w:t>Chosen variant</w:t>
       </w:r>
     </w:p>
     <w:p>
       <w:r>
-        <w:t>Node.js (JavaScript) valiti, sest Express võimaldab kiiresti marsruute, EJS sobib HTML mallide serveripoolseks tõlkimiseks ning üks keel vähendab prototüübis hõõrdumist. Andmete hoidmiseks kasutatakse failipõhist db.json faili (kerge prototüüp, ilma native SQLite kompileerimiseta Windowsis).</w:t>
+        <w:t>For module 4 I chose the Custom Backend variant from the exam brief.</w:t>
       </w:r>
     </w:p>
     <w:p>
-      <w:pPr>
-        <w:pStyle w:val="Heading1"/>
-      </w:pPr>
       <w:r>
-        <w:t>2. Andmemudel (db.json)</w:t>
-      </w:r>
-    </w:p>
-    <w:tbl>
-      <w:tblPr>
-        <w:tblStyle w:val="TableGrid"/>
-        <w:tblW w:type="auto" w:w="0"/>
-        <w:tblLook w:firstColumn="1" w:firstRow="1" w:lastColumn="0" w:lastRow="0" w:noHBand="0" w:noVBand="1" w:val="04A0"/>
-      </w:tblPr>
-      <w:tblGrid>
-        <w:gridCol w:w="4320"/>
-        <w:gridCol w:w="4320"/>
-      </w:tblGrid>
-      <w:tr>
-        <w:tc>
-          <w:tcPr>
-            <w:tcW w:type="dxa" w:w="4320"/>
-          </w:tcPr>
-          <w:p>
-            <w:r>
-              <w:t>Kogum</w:t>
-            </w:r>
-          </w:p>
-        </w:tc>
-        <w:tc>
-          <w:tcPr>
-            <w:tcW w:type="dxa" w:w="4320"/>
-          </w:tcPr>
-          <w:p>
-            <w:r>
-              <w:t>Väljad</w:t>
-            </w:r>
-          </w:p>
-        </w:tc>
-      </w:tr>
-      <w:tr>
-        <w:tc>
-          <w:tcPr>
-            <w:tcW w:type="dxa" w:w="4320"/>
-          </w:tcPr>
-          <w:p>
-            <w:r>
-              <w:t>products</w:t>
-            </w:r>
-          </w:p>
-        </w:tc>
-        <w:tc>
-          <w:tcPr>
-            <w:tcW w:type="dxa" w:w="4320"/>
-          </w:tcPr>
-          <w:p>
-            <w:r>
-              <w:t>id, created_at, name, description, price, category, sizes, colors</w:t>
-            </w:r>
-          </w:p>
-        </w:tc>
-      </w:tr>
-      <w:tr>
-        <w:tc>
-          <w:tcPr>
-            <w:tcW w:type="dxa" w:w="4320"/>
-          </w:tcPr>
-          <w:p>
-            <w:r>
-              <w:t>product_images</w:t>
-            </w:r>
-          </w:p>
-        </w:tc>
-        <w:tc>
-          <w:tcPr>
-            <w:tcW w:type="dxa" w:w="4320"/>
-          </w:tcPr>
-          <w:p>
-            <w:r>
-              <w:t>id, product_id, path</w:t>
-            </w:r>
-          </w:p>
-        </w:tc>
-      </w:tr>
-      <w:tr>
-        <w:tc>
-          <w:tcPr>
-            <w:tcW w:type="dxa" w:w="4320"/>
-          </w:tcPr>
-          <w:p>
-            <w:r>
-              <w:t>contacts</w:t>
-            </w:r>
-          </w:p>
-        </w:tc>
-        <w:tc>
-          <w:tcPr>
-            <w:tcW w:type="dxa" w:w="4320"/>
-          </w:tcPr>
-          <w:p>
-            <w:r>
-              <w:t>id, created_at, name, email, message</w:t>
-            </w:r>
-          </w:p>
-        </w:tc>
-      </w:tr>
-      <w:tr>
-        <w:tc>
-          <w:tcPr>
-            <w:tcW w:type="dxa" w:w="4320"/>
-          </w:tcPr>
-          <w:p>
-            <w:r>
-              <w:t>_nextId</w:t>
-            </w:r>
-          </w:p>
-        </w:tc>
-        <w:tc>
-          <w:tcPr>
-            <w:tcW w:type="dxa" w:w="4320"/>
-          </w:tcPr>
-          <w:p>
-            <w:r>
-              <w:t>autonumbrid</w:t>
-            </w:r>
-          </w:p>
-        </w:tc>
-      </w:tr>
-    </w:tbl>
-    <w:p>
-      <w:pPr>
-        <w:pStyle w:val="Heading1"/>
-      </w:pPr>
-      <w:r>
-        <w:t>3. Moodul 3 vaated backendis</w:t>
+        <w:t>The PDF allows two different directions:</w:t>
       </w:r>
     </w:p>
     <w:p>
@@ -170,7 +48,7 @@
         <w:pStyle w:val="ListBullet"/>
       </w:pPr>
       <w:r>
-        <w:t>shop.html → GET /shop (category, sort, maxPrice)</w:t>
+        <w:t>CMS</w:t>
       </w:r>
     </w:p>
     <w:p>
@@ -178,7 +56,30 @@
         <w:pStyle w:val="ListBullet"/>
       </w:pPr>
       <w:r>
-        <w:t>product.html → GET /product/:id (karussell mallis)</w:t>
+        <w:t>Custom Backend</w:t>
+      </w:r>
+    </w:p>
+    <w:p>
+      <w:r>
+        <w:t>I continued with the custom backend route because I already had the full static site from module 3 and it was more logical to translate that design into real backend views, add an admin side, and connect the contact form and product data to stored records.</w:t>
+      </w:r>
+    </w:p>
+    <w:p>
+      <w:pPr>
+        <w:pStyle w:val="Heading2"/>
+      </w:pPr>
+      <w:r>
+        <w:t>Language choice</w:t>
+      </w:r>
+    </w:p>
+    <w:p>
+      <w:r>
+        <w:t>I built the backend with Node.js and JavaScript, using Express for routing and EJS for server-rendered views.</w:t>
+      </w:r>
+    </w:p>
+    <w:p>
+      <w:r>
+        <w:t>Why I chose this stack:</w:t>
       </w:r>
     </w:p>
     <w:p>
@@ -186,7 +87,7 @@
         <w:pStyle w:val="ListBullet"/>
       </w:pPr>
       <w:r>
-        <w:t>contact.html → POST /contact ja POST /api/contact</w:t>
+        <w:t>JavaScript is already used in the frontend part of the project, so one language is enough for both sides.</w:t>
       </w:r>
     </w:p>
     <w:p>
@@ -194,46 +95,845 @@
         <w:pStyle w:val="ListBullet"/>
       </w:pPr>
       <w:r>
-        <w:t>index.html → staatiline; backend / suunab /shop peale</w:t>
+        <w:t>Express is lightweight and fast to set up for public pages, admin pages, forms, and routing.</w:t>
       </w:r>
     </w:p>
     <w:p>
       <w:pPr>
-        <w:pStyle w:val="Heading1"/>
+        <w:pStyle w:val="ListBullet"/>
       </w:pPr>
       <w:r>
-        <w:t>4. Admin</w:t>
+        <w:t>EJS made it simple to turn the module 3 HTML structure into backend views without rebuilding the whole design from zero.</w:t>
+      </w:r>
+    </w:p>
+    <w:p>
+      <w:pPr>
+        <w:pStyle w:val="ListBullet"/>
+      </w:pPr>
+      <w:r>
+        <w:t>The stack is easy to run locally and does not need a heavy server setup for a project of this size.</w:t>
       </w:r>
     </w:p>
     <w:p>
       <w:r>
-        <w:t>/admin/login, /admin/products (CRUD), /admin/contacts.</w:t>
+        <w:t>Advantages:</w:t>
       </w:r>
     </w:p>
     <w:p>
       <w:pPr>
-        <w:pStyle w:val="Heading1"/>
+        <w:pStyle w:val="ListBullet"/>
       </w:pPr>
       <w:r>
-        <w:t>5. Kontaktide salvestus</w:t>
+        <w:t>quick development</w:t>
+      </w:r>
+    </w:p>
+    <w:p>
+      <w:pPr>
+        <w:pStyle w:val="ListBullet"/>
+      </w:pPr>
+      <w:r>
+        <w:t>simple routing and form handling</w:t>
+      </w:r>
+    </w:p>
+    <w:p>
+      <w:pPr>
+        <w:pStyle w:val="ListBullet"/>
+      </w:pPr>
+      <w:r>
+        <w:t>easy to keep the module 3 frontend and module 4 backend visually similar</w:t>
+      </w:r>
+    </w:p>
+    <w:p>
+      <w:pPr>
+        <w:pStyle w:val="ListBullet"/>
+      </w:pPr>
+      <w:r>
+        <w:t>easy local setup for the examiner</w:t>
       </w:r>
     </w:p>
     <w:p>
       <w:r>
-        <w:t>insertContact() lisab contacts massiivi; db.json.</w:t>
+        <w:t>Disadvantages:</w:t>
       </w:r>
     </w:p>
     <w:p>
       <w:pPr>
-        <w:pStyle w:val="Heading1"/>
+        <w:pStyle w:val="ListBullet"/>
       </w:pPr>
       <w:r>
-        <w:t>6. Eksami nõuded (kokkuvõte)</w:t>
+        <w:t>this project uses a lightweight file-based storage solution, so it is not as scalable as a full SQL setup</w:t>
+      </w:r>
+    </w:p>
+    <w:p>
+      <w:pPr>
+        <w:pStyle w:val="ListBullet"/>
+      </w:pPr>
+      <w:r>
+        <w:t>Node.js and Express do not give as much built-in structure as some larger frameworks</w:t>
+      </w:r>
+    </w:p>
+    <w:p>
+      <w:pPr>
+        <w:pStyle w:val="ListBullet"/>
+      </w:pPr>
+      <w:r>
+        <w:t>for a bigger production shop I would prefer a stronger database layer and stricter validation</w:t>
+      </w:r>
+    </w:p>
+    <w:p>
+      <w:pPr>
+        <w:pStyle w:val="Heading2"/>
+      </w:pPr>
+      <w:r>
+        <w:t>Database structure</w:t>
       </w:r>
     </w:p>
     <w:p>
       <w:r>
-        <w:t>Keele põhjendus, andmemudel, vaadete seos, admin login, toodete CRUD, töötav kontaktivorm, installijuhend ja tarkvara nimekiri, git-link.txt (vt juur README.md).</w:t>
+        <w:t>The backend stores data in `moodul4/backend/db.json`.</w:t>
+      </w:r>
+    </w:p>
+    <w:p>
+      <w:r>
+        <w:t>This file acts as the data dump for the project and contains:</w:t>
+      </w:r>
+    </w:p>
+    <w:p>
+      <w:pPr>
+        <w:pStyle w:val="ListBullet"/>
+      </w:pPr>
+      <w:r>
+        <w:t>`products`</w:t>
+      </w:r>
+    </w:p>
+    <w:p>
+      <w:pPr>
+        <w:pStyle w:val="ListBullet2"/>
+      </w:pPr>
+      <w:r>
+        <w:t>`id`</w:t>
+      </w:r>
+    </w:p>
+    <w:p>
+      <w:pPr>
+        <w:pStyle w:val="ListBullet2"/>
+      </w:pPr>
+      <w:r>
+        <w:t>`created_at`</w:t>
+      </w:r>
+    </w:p>
+    <w:p>
+      <w:pPr>
+        <w:pStyle w:val="ListBullet2"/>
+      </w:pPr>
+      <w:r>
+        <w:t>`name`</w:t>
+      </w:r>
+    </w:p>
+    <w:p>
+      <w:pPr>
+        <w:pStyle w:val="ListBullet2"/>
+      </w:pPr>
+      <w:r>
+        <w:t>`description`</w:t>
+      </w:r>
+    </w:p>
+    <w:p>
+      <w:pPr>
+        <w:pStyle w:val="ListBullet2"/>
+      </w:pPr>
+      <w:r>
+        <w:t>`price`</w:t>
+      </w:r>
+    </w:p>
+    <w:p>
+      <w:pPr>
+        <w:pStyle w:val="ListBullet2"/>
+      </w:pPr>
+      <w:r>
+        <w:t>`category`</w:t>
+      </w:r>
+    </w:p>
+    <w:p>
+      <w:pPr>
+        <w:pStyle w:val="ListBullet2"/>
+      </w:pPr>
+      <w:r>
+        <w:t>`sizes`</w:t>
+      </w:r>
+    </w:p>
+    <w:p>
+      <w:pPr>
+        <w:pStyle w:val="ListBullet2"/>
+      </w:pPr>
+      <w:r>
+        <w:t>`colors`</w:t>
+      </w:r>
+    </w:p>
+    <w:p>
+      <w:pPr>
+        <w:pStyle w:val="ListBullet"/>
+      </w:pPr>
+      <w:r>
+        <w:t>`product_images`</w:t>
+      </w:r>
+    </w:p>
+    <w:p>
+      <w:pPr>
+        <w:pStyle w:val="ListBullet2"/>
+      </w:pPr>
+      <w:r>
+        <w:t>`id`</w:t>
+      </w:r>
+    </w:p>
+    <w:p>
+      <w:pPr>
+        <w:pStyle w:val="ListBullet2"/>
+      </w:pPr>
+      <w:r>
+        <w:t>`product_id`</w:t>
+      </w:r>
+    </w:p>
+    <w:p>
+      <w:pPr>
+        <w:pStyle w:val="ListBullet2"/>
+      </w:pPr>
+      <w:r>
+        <w:t>`path`</w:t>
+      </w:r>
+    </w:p>
+    <w:p>
+      <w:pPr>
+        <w:pStyle w:val="ListBullet"/>
+      </w:pPr>
+      <w:r>
+        <w:t>`contacts`</w:t>
+      </w:r>
+    </w:p>
+    <w:p>
+      <w:pPr>
+        <w:pStyle w:val="ListBullet2"/>
+      </w:pPr>
+      <w:r>
+        <w:t>`id`</w:t>
+      </w:r>
+    </w:p>
+    <w:p>
+      <w:pPr>
+        <w:pStyle w:val="ListBullet2"/>
+      </w:pPr>
+      <w:r>
+        <w:t>`created_at`</w:t>
+      </w:r>
+    </w:p>
+    <w:p>
+      <w:pPr>
+        <w:pStyle w:val="ListBullet2"/>
+      </w:pPr>
+      <w:r>
+        <w:t>`name`</w:t>
+      </w:r>
+    </w:p>
+    <w:p>
+      <w:pPr>
+        <w:pStyle w:val="ListBullet2"/>
+      </w:pPr>
+      <w:r>
+        <w:t>`email`</w:t>
+      </w:r>
+    </w:p>
+    <w:p>
+      <w:pPr>
+        <w:pStyle w:val="ListBullet2"/>
+      </w:pPr>
+      <w:r>
+        <w:t>`message`</w:t>
+      </w:r>
+    </w:p>
+    <w:p>
+      <w:pPr>
+        <w:pStyle w:val="ListBullet"/>
+      </w:pPr>
+      <w:r>
+        <w:t>`_nextId`</w:t>
+      </w:r>
+    </w:p>
+    <w:p>
+      <w:pPr>
+        <w:pStyle w:val="ListBullet2"/>
+      </w:pPr>
+      <w:r>
+        <w:t>counters for new rows</w:t>
+      </w:r>
+    </w:p>
+    <w:p>
+      <w:r>
+        <w:t>The product and image split makes it possible to store multiple images for one product, which was required for the product detail view.</w:t>
+      </w:r>
+    </w:p>
+    <w:p>
+      <w:pPr>
+        <w:pStyle w:val="Heading2"/>
+      </w:pPr>
+      <w:r>
+        <w:t>Translation of module 3 into backend views</w:t>
+      </w:r>
+    </w:p>
+    <w:p>
+      <w:r>
+        <w:t>The static pages from module 3 were translated into backend views:</w:t>
+      </w:r>
+    </w:p>
+    <w:p>
+      <w:pPr>
+        <w:pStyle w:val="ListBullet"/>
+      </w:pPr>
+      <w:r>
+        <w:t>`index.html` -&gt; `/`</w:t>
+      </w:r>
+    </w:p>
+    <w:p>
+      <w:pPr>
+        <w:pStyle w:val="ListBullet"/>
+      </w:pPr>
+      <w:r>
+        <w:t>`shop.html` -&gt; `/shop`</w:t>
+      </w:r>
+    </w:p>
+    <w:p>
+      <w:pPr>
+        <w:pStyle w:val="ListBullet"/>
+      </w:pPr>
+      <w:r>
+        <w:t>`product.html` -&gt; `/product/:id`</w:t>
+      </w:r>
+    </w:p>
+    <w:p>
+      <w:pPr>
+        <w:pStyle w:val="ListBullet"/>
+      </w:pPr>
+      <w:r>
+        <w:t>`contact.html` -&gt; `/contact`</w:t>
+      </w:r>
+    </w:p>
+    <w:p>
+      <w:r>
+        <w:t>The backend keeps the same visual identity:</w:t>
+      </w:r>
+    </w:p>
+    <w:p>
+      <w:pPr>
+        <w:pStyle w:val="ListBullet"/>
+      </w:pPr>
+      <w:r>
+        <w:t>same logo and color direction</w:t>
+      </w:r>
+    </w:p>
+    <w:p>
+      <w:pPr>
+        <w:pStyle w:val="ListBullet"/>
+      </w:pPr>
+      <w:r>
+        <w:t>same esports landing-page style</w:t>
+      </w:r>
+    </w:p>
+    <w:p>
+      <w:pPr>
+        <w:pStyle w:val="ListBullet"/>
+      </w:pPr>
+      <w:r>
+        <w:t>same store and product-detail structure</w:t>
+      </w:r>
+    </w:p>
+    <w:p>
+      <w:pPr>
+        <w:pStyle w:val="ListBullet"/>
+      </w:pPr>
+      <w:r>
+        <w:t>same contact page idea</w:t>
+      </w:r>
+    </w:p>
+    <w:p>
+      <w:r>
+        <w:t>This means module 4 follows the brief requirement to translate the module 3 HTML, CSS, and JS into views that the backend uses.</w:t>
+      </w:r>
+    </w:p>
+    <w:p>
+      <w:pPr>
+        <w:pStyle w:val="Heading2"/>
+      </w:pPr>
+      <w:r>
+        <w:t>Public side</w:t>
+      </w:r>
+    </w:p>
+    <w:p>
+      <w:r>
+        <w:t>The public side contains:</w:t>
+      </w:r>
+    </w:p>
+    <w:p>
+      <w:pPr>
+        <w:pStyle w:val="ListBullet"/>
+      </w:pPr>
+      <w:r>
+        <w:t>`/` home page</w:t>
+      </w:r>
+    </w:p>
+    <w:p>
+      <w:pPr>
+        <w:pStyle w:val="ListBullet"/>
+      </w:pPr>
+      <w:r>
+        <w:t>`/shop` product listing</w:t>
+      </w:r>
+    </w:p>
+    <w:p>
+      <w:pPr>
+        <w:pStyle w:val="ListBullet"/>
+      </w:pPr>
+      <w:r>
+        <w:t>`/product/:id` product detail page</w:t>
+      </w:r>
+    </w:p>
+    <w:p>
+      <w:pPr>
+        <w:pStyle w:val="ListBullet"/>
+      </w:pPr>
+      <w:r>
+        <w:t>`/contact` contact form page</w:t>
+      </w:r>
+    </w:p>
+    <w:p>
+      <w:pPr>
+        <w:pStyle w:val="ListBullet"/>
+      </w:pPr>
+      <w:r>
+        <w:t>`/api/contact` JSON endpoint for form submissions from the static module 3 version</w:t>
+      </w:r>
+    </w:p>
+    <w:p>
+      <w:r>
+        <w:t>The product page supports:</w:t>
+      </w:r>
+    </w:p>
+    <w:p>
+      <w:pPr>
+        <w:pStyle w:val="ListBullet"/>
+      </w:pPr>
+      <w:r>
+        <w:t>multiple product images</w:t>
+      </w:r>
+    </w:p>
+    <w:p>
+      <w:pPr>
+        <w:pStyle w:val="ListBullet"/>
+      </w:pPr>
+      <w:r>
+        <w:t>product name</w:t>
+      </w:r>
+    </w:p>
+    <w:p>
+      <w:pPr>
+        <w:pStyle w:val="ListBullet"/>
+      </w:pPr>
+      <w:r>
+        <w:t>description</w:t>
+      </w:r>
+    </w:p>
+    <w:p>
+      <w:pPr>
+        <w:pStyle w:val="ListBullet"/>
+      </w:pPr>
+      <w:r>
+        <w:t>sizes</w:t>
+      </w:r>
+    </w:p>
+    <w:p>
+      <w:pPr>
+        <w:pStyle w:val="ListBullet"/>
+      </w:pPr>
+      <w:r>
+        <w:t>colors</w:t>
+      </w:r>
+    </w:p>
+    <w:p>
+      <w:pPr>
+        <w:pStyle w:val="Heading2"/>
+      </w:pPr>
+      <w:r>
+        <w:t>Admin side</w:t>
+      </w:r>
+    </w:p>
+    <w:p>
+      <w:r>
+        <w:t>The admin side includes the required logic and views:</w:t>
+      </w:r>
+    </w:p>
+    <w:p>
+      <w:pPr>
+        <w:pStyle w:val="ListBullet"/>
+      </w:pPr>
+      <w:r>
+        <w:t>login</w:t>
+      </w:r>
+    </w:p>
+    <w:p>
+      <w:pPr>
+        <w:pStyle w:val="ListBullet"/>
+      </w:pPr>
+      <w:r>
+        <w:t>product list</w:t>
+      </w:r>
+    </w:p>
+    <w:p>
+      <w:pPr>
+        <w:pStyle w:val="ListBullet"/>
+      </w:pPr>
+      <w:r>
+        <w:t>add product form</w:t>
+      </w:r>
+    </w:p>
+    <w:p>
+      <w:pPr>
+        <w:pStyle w:val="ListBullet"/>
+      </w:pPr>
+      <w:r>
+        <w:t>edit product form</w:t>
+      </w:r>
+    </w:p>
+    <w:p>
+      <w:pPr>
+        <w:pStyle w:val="ListBullet"/>
+      </w:pPr>
+      <w:r>
+        <w:t>delete product action</w:t>
+      </w:r>
+    </w:p>
+    <w:p>
+      <w:pPr>
+        <w:pStyle w:val="ListBullet"/>
+      </w:pPr>
+      <w:r>
+        <w:t>contact message view</w:t>
+      </w:r>
+    </w:p>
+    <w:p>
+      <w:r>
+        <w:t>The product forms support the required fields from the PDF:</w:t>
+      </w:r>
+    </w:p>
+    <w:p>
+      <w:pPr>
+        <w:pStyle w:val="ListBullet"/>
+      </w:pPr>
+      <w:r>
+        <w:t>product name</w:t>
+      </w:r>
+    </w:p>
+    <w:p>
+      <w:pPr>
+        <w:pStyle w:val="ListBullet"/>
+      </w:pPr>
+      <w:r>
+        <w:t>product description</w:t>
+      </w:r>
+    </w:p>
+    <w:p>
+      <w:pPr>
+        <w:pStyle w:val="ListBullet"/>
+      </w:pPr>
+      <w:r>
+        <w:t>product images</w:t>
+      </w:r>
+    </w:p>
+    <w:p>
+      <w:pPr>
+        <w:pStyle w:val="ListBullet"/>
+      </w:pPr>
+      <w:r>
+        <w:t>product sizes</w:t>
+      </w:r>
+    </w:p>
+    <w:p>
+      <w:pPr>
+        <w:pStyle w:val="ListBullet"/>
+      </w:pPr>
+      <w:r>
+        <w:t>product colors</w:t>
+      </w:r>
+    </w:p>
+    <w:p>
+      <w:r>
+        <w:t>Additional data such as category and price are also included because they are useful for the store page.</w:t>
+      </w:r>
+    </w:p>
+    <w:p>
+      <w:pPr>
+        <w:pStyle w:val="Heading2"/>
+      </w:pPr>
+      <w:r>
+        <w:t>Contact form</w:t>
+      </w:r>
+    </w:p>
+    <w:p>
+      <w:r>
+        <w:t>The contact form works in the backend version.</w:t>
+      </w:r>
+    </w:p>
+    <w:p>
+      <w:r>
+        <w:t>When a user submits the form:</w:t>
+      </w:r>
+    </w:p>
+    <w:p>
+      <w:pPr>
+        <w:pStyle w:val="ListBullet"/>
+      </w:pPr>
+      <w:r>
+        <w:t>the request is validated</w:t>
+      </w:r>
+    </w:p>
+    <w:p>
+      <w:pPr>
+        <w:pStyle w:val="ListBullet"/>
+      </w:pPr>
+      <w:r>
+        <w:t>the message is saved into `db.json`</w:t>
+      </w:r>
+    </w:p>
+    <w:p>
+      <w:pPr>
+        <w:pStyle w:val="ListBullet"/>
+      </w:pPr>
+      <w:r>
+        <w:t>the saved messages are visible in the admin area at `/admin/contacts`</w:t>
+      </w:r>
+    </w:p>
+    <w:p>
+      <w:r>
+        <w:t>So the form is not only visual - it actually stores usable data for the site administrator.</w:t>
+      </w:r>
+    </w:p>
+    <w:p>
+      <w:pPr>
+        <w:pStyle w:val="Heading2"/>
+      </w:pPr>
+      <w:r>
+        <w:t>Assets and product images</w:t>
+      </w:r>
+    </w:p>
+    <w:p>
+      <w:r>
+        <w:t>The backend copies and serves local assets from the project itself:</w:t>
+      </w:r>
+    </w:p>
+    <w:p>
+      <w:pPr>
+        <w:pStyle w:val="ListBullet"/>
+      </w:pPr>
+      <w:r>
+        <w:t>product images are available in `moodul4/backend/public/catalog/`</w:t>
+      </w:r>
+    </w:p>
+    <w:p>
+      <w:pPr>
+        <w:pStyle w:val="ListBullet"/>
+      </w:pPr>
+      <w:r>
+        <w:t>team images are available in `moodul4/backend/public/team/`</w:t>
+      </w:r>
+    </w:p>
+    <w:p>
+      <w:pPr>
+        <w:pStyle w:val="ListBullet"/>
+      </w:pPr>
+      <w:r>
+        <w:t>game logos are available in `moodul4/backend/public/games/`</w:t>
+      </w:r>
+    </w:p>
+    <w:p>
+      <w:pPr>
+        <w:pStyle w:val="ListBullet"/>
+      </w:pPr>
+      <w:r>
+        <w:t>the site logo is available in `moodul4/backend/public/nexus_logo.svg`</w:t>
+      </w:r>
+    </w:p>
+    <w:p>
+      <w:r>
+        <w:t>This keeps the backend self-contained and easy to run after installation.</w:t>
+      </w:r>
+    </w:p>
+    <w:p>
+      <w:pPr>
+        <w:pStyle w:val="Heading2"/>
+      </w:pPr>
+      <w:r>
+        <w:t>Install and testing</w:t>
+      </w:r>
+    </w:p>
+    <w:p>
+      <w:r>
+        <w:t>The installation guide is in:</w:t>
+      </w:r>
+    </w:p>
+    <w:p>
+      <w:pPr>
+        <w:pStyle w:val="ListBullet"/>
+      </w:pPr>
+      <w:r>
+        <w:t>`moodul4/installijuhend.txt`</w:t>
+      </w:r>
+    </w:p>
+    <w:p>
+      <w:r>
+        <w:t>The Git repository link is included in:</w:t>
+      </w:r>
+    </w:p>
+    <w:p>
+      <w:pPr>
+        <w:pStyle w:val="ListBullet"/>
+      </w:pPr>
+      <w:r>
+        <w:t>`moodul4/git-link.txt`</w:t>
+      </w:r>
+    </w:p>
+    <w:p>
+      <w:r>
+        <w:t>Routes that can be checked quickly in the browser:</w:t>
+      </w:r>
+    </w:p>
+    <w:p>
+      <w:pPr>
+        <w:pStyle w:val="ListBullet"/>
+      </w:pPr>
+      <w:r>
+        <w:t>`/`</w:t>
+      </w:r>
+    </w:p>
+    <w:p>
+      <w:pPr>
+        <w:pStyle w:val="ListBullet"/>
+      </w:pPr>
+      <w:r>
+        <w:t>`/shop`</w:t>
+      </w:r>
+    </w:p>
+    <w:p>
+      <w:pPr>
+        <w:pStyle w:val="ListBullet"/>
+      </w:pPr>
+      <w:r>
+        <w:t>`/product/1`</w:t>
+      </w:r>
+    </w:p>
+    <w:p>
+      <w:pPr>
+        <w:pStyle w:val="ListBullet"/>
+      </w:pPr>
+      <w:r>
+        <w:t>`/contact`</w:t>
+      </w:r>
+    </w:p>
+    <w:p>
+      <w:pPr>
+        <w:pStyle w:val="ListBullet"/>
+      </w:pPr>
+      <w:r>
+        <w:t>`/admin/login`</w:t>
+      </w:r>
+    </w:p>
+    <w:p>
+      <w:pPr>
+        <w:pStyle w:val="ListBullet"/>
+      </w:pPr>
+      <w:r>
+        <w:t>`/admin/products`</w:t>
+      </w:r>
+    </w:p>
+    <w:p>
+      <w:pPr>
+        <w:pStyle w:val="ListBullet"/>
+      </w:pPr>
+      <w:r>
+        <w:t>`/admin/contacts`</w:t>
+      </w:r>
+    </w:p>
+    <w:p>
+      <w:pPr>
+        <w:pStyle w:val="Heading2"/>
+      </w:pPr>
+      <w:r>
+        <w:t>Final note</w:t>
+      </w:r>
+    </w:p>
+    <w:p>
+      <w:r>
+        <w:t>This module follows the Custom Backend branch of the exam brief:</w:t>
+      </w:r>
+    </w:p>
+    <w:p>
+      <w:pPr>
+        <w:pStyle w:val="ListBullet"/>
+      </w:pPr>
+      <w:r>
+        <w:t>custom backend language chosen and explained</w:t>
+      </w:r>
+    </w:p>
+    <w:p>
+      <w:pPr>
+        <w:pStyle w:val="ListBullet"/>
+      </w:pPr>
+      <w:r>
+        <w:t>data structure included</w:t>
+      </w:r>
+    </w:p>
+    <w:p>
+      <w:pPr>
+        <w:pStyle w:val="ListBullet"/>
+      </w:pPr>
+      <w:r>
+        <w:t>module 3 translated into backend views</w:t>
+      </w:r>
+    </w:p>
+    <w:p>
+      <w:pPr>
+        <w:pStyle w:val="ListBullet"/>
+      </w:pPr>
+      <w:r>
+        <w:t>admin logic created</w:t>
+      </w:r>
+    </w:p>
+    <w:p>
+      <w:pPr>
+        <w:pStyle w:val="ListBullet"/>
+      </w:pPr>
+      <w:r>
+        <w:t>product add/edit/delete supported</w:t>
+      </w:r>
+    </w:p>
+    <w:p>
+      <w:pPr>
+        <w:pStyle w:val="ListBullet"/>
+      </w:pPr>
+      <w:r>
+        <w:t>contact form works</w:t>
+      </w:r>
+    </w:p>
+    <w:p>
+      <w:pPr>
+        <w:pStyle w:val="ListBullet"/>
+      </w:pPr>
+      <w:r>
+        <w:t>install guide included</w:t>
+      </w:r>
+    </w:p>
+    <w:p>
+      <w:pPr>
+        <w:pStyle w:val="ListBullet"/>
+      </w:pPr>
+      <w:r>
+        <w:t>Git link included</w:t>
       </w:r>
     </w:p>
     <w:sectPr>
@@ -609,6 +1309,10 @@
     <w:name w:val="Normal"/>
     <w:qFormat/>
     <w:rsid w:val="00FC693F"/>
+    <w:rPr>
+      <w:rFonts w:ascii="Calibri" w:hAnsi="Calibri"/>
+      <w:sz w:val="22"/>
+    </w:rPr>
   </w:style>
   <w:style w:type="paragraph" w:styleId="Header">
     <w:name w:val="header"/>

</xml_diff>